<commit_message>
Financial proposal: build and deployment in 6 weeks
Milestone payments now fall in weeks 1, 2, 5 and 6; support starts at
go-live after week 6. Amounts are unchanged.

Co-Authored-By: Claude Opus 5.5 <noreply@anthropic.com>
Claude-Session: https://claude.ai/code/session_017SBudR8k4vsApXUz2ChPbE
</commit_message>
<xml_diff>
--- a/docs/proposal/Operation_Rainbow_Financial_Proposal.docx
+++ b/docs/proposal/Operation_Rainbow_Financial_Proposal.docx
@@ -140,7 +140,7 @@
           <w:p>
             <w:pPr/>
             <w:r>
-              <w:t xml:space="preserve">Months 1–7</w:t>
+              <w:t xml:space="preserve">Weeks 1–6</w:t>
             </w:r>
           </w:p>
         </w:tc>
@@ -2468,7 +2468,7 @@
     <w:p>
       <w:pPr/>
       <w:r>
-        <w:t xml:space="preserve">The build is paid in four milestones over about 7 months. Operations are then paid in 8 equal quarterly instalments of ₦25,000,000.</w:t>
+        <w:t xml:space="preserve">The build takes 6 weeks and is paid in four milestones. Telecom networks can take several weeks to approve a USSD shortcode, so those applications are filed in week 1. Operations are then paid in 8 equal quarterly instalments of ₦25,000,000.</w:t>
       </w:r>
     </w:p>
     <w:tbl>
@@ -2608,7 +2608,7 @@
           <w:p>
             <w:pPr/>
             <w:r>
-              <w:t xml:space="preserve">Month 1</w:t>
+              <w:t xml:space="preserve">Week 1</w:t>
             </w:r>
           </w:p>
         </w:tc>
@@ -2680,7 +2680,7 @@
           <w:p>
             <w:pPr/>
             <w:r>
-              <w:t xml:space="preserve">Month 3</w:t>
+              <w:t xml:space="preserve">Week 2</w:t>
             </w:r>
           </w:p>
         </w:tc>
@@ -2752,7 +2752,7 @@
           <w:p>
             <w:pPr/>
             <w:r>
-              <w:t xml:space="preserve">Month 6</w:t>
+              <w:t xml:space="preserve">Week 5</w:t>
             </w:r>
           </w:p>
         </w:tc>
@@ -2824,7 +2824,7 @@
           <w:p>
             <w:pPr/>
             <w:r>
-              <w:t xml:space="preserve">Month 7</w:t>
+              <w:t xml:space="preserve">Week 6</w:t>
             </w:r>
           </w:p>
         </w:tc>
@@ -3125,7 +3125,7 @@
         </w:numPr>
       </w:pPr>
       <w:r>
-        <w:t xml:space="preserve">The 24-month support period starts on the go-live date.</w:t>
+        <w:t xml:space="preserve">Build and deployment take 6 weeks from contract signing. The 24-month support period starts at go-live, at the end of week 6.</w:t>
       </w:r>
     </w:p>
     <w:p>

</xml_diff>